<commit_message>
design(glass): incorporate Glass System material into ViewProof brand
- Tokens retinted (proof-green/sun/sky blobs, white fills); canvas blobs on body; .glass/.glass-soft/.glass-pill/.glass-input classes + transparency fallback
- Floating glass-pill header; reading cards glass, controls frosted, solid CTAs + pastel banners untouched
- Design System docx: glass recipe section + token table
</commit_message>
<xml_diff>
--- a/ViewProof Design System.docx
+++ b/ViewProof Design System.docx
@@ -1866,6 +1866,299 @@
         <w:t>Make every fact easy to see, every uncertainty easy to understand, and every next step easy to take.</w:t>
       </w:r>
     </w:p>
+    <w:p>
+      <w:pPr>
+        <w:pStyle w:val="Heading2"/>
+      </w:pPr>
+      <w:r>
+        <w:t>3.6 Glass material — Glass System recipe, retinted (new v1.2)</w:t>
+      </w:r>
+    </w:p>
+    <w:p>
+      <w:pPr>
+        <w:pStyle w:val="ListBullet"/>
+      </w:pPr>
+      <w:r>
+        <w:t>Source: glassmorphism/ folder (tokens.json + web/tokens.css + web/glass.css + GlassComponents.jsx). Brand retint applied: blobs use proof-green/sun/sky at ~20% opacity, never the demo indigo/teal/orange/pink.</w:t>
+      </w:r>
+    </w:p>
+    <w:p>
+      <w:pPr>
+        <w:pStyle w:val="ListBullet"/>
+      </w:pPr>
+      <w:r>
+        <w:t>Recipe: blur md 18px + saturation 1.4; fillStrong white 78% for reading cards (ink text keeps ≥4.5:1); hairline white 70% border + ink 10% edge; shadow 0 8 32 rgba(8,12,32,.16).</w:t>
+      </w:r>
+    </w:p>
+    <w:p>
+      <w:pPr>
+        <w:pStyle w:val="ListBullet"/>
+      </w:pPr>
+      <w:r>
+        <w:t>Canvas: body::before/::after fixed brand blobs, faint — blur reads, never shouts. APK WebView and PWA both render backdrop-filter (webkit-prefixed).</w:t>
+      </w:r>
+    </w:p>
+    <w:p>
+      <w:pPr>
+        <w:pStyle w:val="ListBullet"/>
+      </w:pPr>
+      <w:r>
+        <w:t>Rules: primary CTAs stay SOLID proof-green; status banners stay SOLID pastels; evidence status still icon + label + words, never glass alone. Glass is depth, not meaning.</w:t>
+      </w:r>
+    </w:p>
+    <w:p>
+      <w:pPr>
+        <w:pStyle w:val="ListBullet"/>
+      </w:pPr>
+      <w:r>
+        <w:t>Classes: .glass (reading cards) / .glass-soft (controls) / .glass-pill (floating header) / .glass-input (fields, proof-green focus). Hover lift on precise pointers only; calm 220ms ease.</w:t>
+      </w:r>
+    </w:p>
+    <w:p>
+      <w:pPr>
+        <w:pStyle w:val="ListBullet"/>
+      </w:pPr>
+      <w:r>
+        <w:t>Fallbacks: prefers-reduced-transparency → solid 97% white, no blur, no blobs. Low-end devices: blur-md max on cards, blur-sm on controls.</w:t>
+      </w:r>
+    </w:p>
+    <w:tbl>
+      <w:tblPr>
+        <w:tblStyle w:val="LightGrid-Accent1"/>
+        <w:tblW w:type="auto" w:w="0"/>
+        <w:tblLook w:firstColumn="1" w:firstRow="1" w:lastColumn="0" w:lastRow="0" w:noHBand="0" w:noVBand="1" w:val="04A0"/>
+      </w:tblPr>
+      <w:tblGrid>
+        <w:gridCol w:w="2880"/>
+        <w:gridCol w:w="2880"/>
+        <w:gridCol w:w="2880"/>
+      </w:tblGrid>
+      <w:tr>
+        <w:tc>
+          <w:tcPr>
+            <w:tcW w:type="dxa" w:w="2880"/>
+          </w:tcPr>
+          <w:p>
+            <w:r>
+              <w:t>Glass token</w:t>
+            </w:r>
+          </w:p>
+        </w:tc>
+        <w:tc>
+          <w:tcPr>
+            <w:tcW w:type="dxa" w:w="2880"/>
+          </w:tcPr>
+          <w:p>
+            <w:r>
+              <w:t>Value (brand)</w:t>
+            </w:r>
+          </w:p>
+        </w:tc>
+        <w:tc>
+          <w:tcPr>
+            <w:tcW w:type="dxa" w:w="2880"/>
+          </w:tcPr>
+          <w:p>
+            <w:r>
+              <w:t>CSS var</w:t>
+            </w:r>
+          </w:p>
+        </w:tc>
+      </w:tr>
+      <w:tr>
+        <w:tc>
+          <w:tcPr>
+            <w:tcW w:type="dxa" w:w="2880"/>
+          </w:tcPr>
+          <w:p>
+            <w:r>
+              <w:t>blur md / saturation</w:t>
+            </w:r>
+          </w:p>
+        </w:tc>
+        <w:tc>
+          <w:tcPr>
+            <w:tcW w:type="dxa" w:w="2880"/>
+          </w:tcPr>
+          <w:p>
+            <w:r>
+              <w:t>18px / 1.4</w:t>
+            </w:r>
+          </w:p>
+        </w:tc>
+        <w:tc>
+          <w:tcPr>
+            <w:tcW w:type="dxa" w:w="2880"/>
+          </w:tcPr>
+          <w:p>
+            <w:r>
+              <w:t>--glass-blur-md / --glass-saturation</w:t>
+            </w:r>
+          </w:p>
+        </w:tc>
+      </w:tr>
+      <w:tr>
+        <w:tc>
+          <w:tcPr>
+            <w:tcW w:type="dxa" w:w="2880"/>
+          </w:tcPr>
+          <w:p>
+            <w:r>
+              <w:t>fillStrong (cards)</w:t>
+            </w:r>
+          </w:p>
+        </w:tc>
+        <w:tc>
+          <w:tcPr>
+            <w:tcW w:type="dxa" w:w="2880"/>
+          </w:tcPr>
+          <w:p>
+            <w:r>
+              <w:t>white 78%</w:t>
+            </w:r>
+          </w:p>
+        </w:tc>
+        <w:tc>
+          <w:tcPr>
+            <w:tcW w:type="dxa" w:w="2880"/>
+          </w:tcPr>
+          <w:p>
+            <w:r>
+              <w:t>--glass-fill-strong</w:t>
+            </w:r>
+          </w:p>
+        </w:tc>
+      </w:tr>
+      <w:tr>
+        <w:tc>
+          <w:tcPr>
+            <w:tcW w:type="dxa" w:w="2880"/>
+          </w:tcPr>
+          <w:p>
+            <w:r>
+              <w:t>fill (controls)</w:t>
+            </w:r>
+          </w:p>
+        </w:tc>
+        <w:tc>
+          <w:tcPr>
+            <w:tcW w:type="dxa" w:w="2880"/>
+          </w:tcPr>
+          <w:p>
+            <w:r>
+              <w:t>white 55%</w:t>
+            </w:r>
+          </w:p>
+        </w:tc>
+        <w:tc>
+          <w:tcPr>
+            <w:tcW w:type="dxa" w:w="2880"/>
+          </w:tcPr>
+          <w:p>
+            <w:r>
+              <w:t>--glass-fill</w:t>
+            </w:r>
+          </w:p>
+        </w:tc>
+      </w:tr>
+      <w:tr>
+        <w:tc>
+          <w:tcPr>
+            <w:tcW w:type="dxa" w:w="2880"/>
+          </w:tcPr>
+          <w:p>
+            <w:r>
+              <w:t>border</w:t>
+            </w:r>
+          </w:p>
+        </w:tc>
+        <w:tc>
+          <w:tcPr>
+            <w:tcW w:type="dxa" w:w="2880"/>
+          </w:tcPr>
+          <w:p>
+            <w:r>
+              <w:t>white 70% + ink 10% edge</w:t>
+            </w:r>
+          </w:p>
+        </w:tc>
+        <w:tc>
+          <w:tcPr>
+            <w:tcW w:type="dxa" w:w="2880"/>
+          </w:tcPr>
+          <w:p>
+            <w:r>
+              <w:t>--glass-border / --glass-border-edge</w:t>
+            </w:r>
+          </w:p>
+        </w:tc>
+      </w:tr>
+      <w:tr>
+        <w:tc>
+          <w:tcPr>
+            <w:tcW w:type="dxa" w:w="2880"/>
+          </w:tcPr>
+          <w:p>
+            <w:r>
+              <w:t>shadow</w:t>
+            </w:r>
+          </w:p>
+        </w:tc>
+        <w:tc>
+          <w:tcPr>
+            <w:tcW w:type="dxa" w:w="2880"/>
+          </w:tcPr>
+          <w:p>
+            <w:r>
+              <w:t>0 8 32 rgba(8,12,32,.16)</w:t>
+            </w:r>
+          </w:p>
+        </w:tc>
+        <w:tc>
+          <w:tcPr>
+            <w:tcW w:type="dxa" w:w="2880"/>
+          </w:tcPr>
+          <w:p>
+            <w:r>
+              <w:t>--glass-shadow</w:t>
+            </w:r>
+          </w:p>
+        </w:tc>
+      </w:tr>
+      <w:tr>
+        <w:tc>
+          <w:tcPr>
+            <w:tcW w:type="dxa" w:w="2880"/>
+          </w:tcPr>
+          <w:p>
+            <w:r>
+              <w:t>blobs</w:t>
+            </w:r>
+          </w:p>
+        </w:tc>
+        <w:tc>
+          <w:tcPr>
+            <w:tcW w:type="dxa" w:w="2880"/>
+          </w:tcPr>
+          <w:p>
+            <w:r>
+              <w:t>proof-green/sun/sky ~20%</w:t>
+            </w:r>
+          </w:p>
+        </w:tc>
+        <w:tc>
+          <w:tcPr>
+            <w:tcW w:type="dxa" w:w="2880"/>
+          </w:tcPr>
+          <w:p>
+            <w:r>
+              <w:t>--glass-blob-a/b/c</w:t>
+            </w:r>
+          </w:p>
+        </w:tc>
+      </w:tr>
+    </w:tbl>
+    <w:p/>
     <w:sectPr>
       <w:pgSz w:w="12240" w:h="15840"/>
       <w:pgMar w:top="1440" w:right="1800" w:bottom="1440" w:left="1800" w:header="720" w:footer="720" w:gutter="0"/>

</xml_diff>